<commit_message>
Polish English project report
</commit_message>
<xml_diff>
--- a/reports/HAR_RV_Project_Report.docx
+++ b/reports/HAR_RV_Project_Report.docx
@@ -34,7 +34,7 @@
           <w:sz w:val="22"/>
           <w:lang w:val="en-US"/>
         </w:rPr>
-        <w:t>Data Analysis Model Specification and Out-of-Sample Evaluation</w:t>
+        <w:t>Model specification and forecast evaluation</w:t>
       </w:r>
     </w:p>
     <w:p>
@@ -52,7 +52,7 @@
           <w:sz w:val="21"/>
           <w:lang w:val="en-US"/>
         </w:rPr>
-        <w:t>This report uses a heterogeneous autoregressive realized volatility model to forecast next-trading-day log realized variance for the S&amp;P 500 Index. The model combines daily, weekly, and monthly volatility information and uses chronological sample splits. Adding Lag 2 lowers mean squared error by approximately 1.47% in five-fold time-series cross-validation and 1.49% on the independent test set. The evidence supports retaining Lag 2, but the gain is small and significant residual autocorrelation remains in the test period.</w:t>
+        <w:t>This report forecasts next-trading-day log realized variance for the S&amp;P 500 using a heterogeneous autoregressive model (HAR-RV) with daily, weekly, and monthly components. Compared with standard HAR-RV, adding Lag 2 reduces mean squared error by about 1.47% in five-fold time-series cross-validation and 1.49% on the independent test set. These results support retaining Lag 2, although the gain is small and significant residual autocorrelation remains in the test period.</w:t>
       </w:r>
     </w:p>
     <w:p>
@@ -88,7 +88,7 @@
           <w:sz w:val="22"/>
           <w:lang w:val="en-US"/>
         </w:rPr>
-        <w:t>Descriptive statistics use training-period data only and cover the S&amp;P 500 Index (.SPX), Dow Jones Industrial Average (.DJI), and Russell 2000 Index (.RUT). None of the three series contains an invalid RV5 observation in the training sample. Realized variance measures daily variation, and the model forecasts its logarithm.</w:t>
+        <w:t>Table 1 summarizes training-period data for the S&amp;P 500 (.SPX), Dow Jones Industrial Average (.DJI), and Russell 2000 (.RUT). All three series have zero invalid RV5 observations in this sample. The analysis uses realized variance to measure daily variation and forecasts its logarithm.</w:t>
       </w:r>
     </w:p>
     <w:p>
@@ -245,7 +245,7 @@
                 <w:sz w:val="15"/>
                 <w:lang w:val="en-US"/>
               </w:rPr>
-              <w:t>N Return</w:t>
+              <w:t>N Returns</w:t>
             </w:r>
           </w:p>
         </w:tc>
@@ -1469,7 +1469,7 @@
           <w:sz w:val="22"/>
           <w:lang w:val="en-US"/>
         </w:rPr>
-        <w:t>Mean daily returns are close to zero and absolute skewness is below 0.12 for all three indices. Excess kurtosis ranges from 5.52 to 7.78, well above the normal-distribution value of zero. The return distributions are therefore approximately symmetric but sharply peaked and heavy-tailed, so a normal model may understate the frequency of extreme returns.</w:t>
+        <w:t>For all three indices, mean daily returns are close to zero and absolute skewness is below 0.12. Excess kurtosis ranges from 5.52 to 7.78, compared with zero for a normal distribution. The returns are roughly symmetric but heavy-tailed, so a normal model may understate the frequency of extreme returns.</w:t>
       </w:r>
     </w:p>
     <w:p>
@@ -1551,7 +1551,7 @@
           <w:sz w:val="22"/>
           <w:lang w:val="en-US"/>
         </w:rPr>
-        <w:t>Observations near the center of the Q-Q plot broadly follow the normal reference line, while both tails diverge materially. This is consistent with heavy-tailed returns. The figure concerns the return distribution and does not establish the distribution of forecast errors, which must be assessed separately with out-of-sample residual diagnostics.</w:t>
+        <w:t>The Q-Q plot follows the normal reference line near the center and departs from it in both tails, consistent with heavy-tailed returns. This describes the return distribution; forecast errors require separate assessment through out-of-sample residual diagnostics.</w:t>
       </w:r>
     </w:p>
     <w:p>
@@ -1587,7 +1587,7 @@
           <w:sz w:val="22"/>
           <w:lang w:val="en-US"/>
         </w:rPr>
-        <w:t>Realized variance is persistent. HAR-RV uses daily, weekly, and monthly components to represent information operating over different horizons and to forecast the next day. This structure makes the incremental contribution of each horizon easy to examine, but it does not directly model heavy-tailed returns.</w:t>
+        <w:t>HAR-RV captures persistence in realized variance through daily, weekly, and monthly components. These components summarize historical information over different horizons, allowing their contributions to the next-day forecast to be compared. The model describes variance dynamics and does not directly model the tails of the return distribution.</w:t>
       </w:r>
     </w:p>
     <w:p>
@@ -1606,7 +1606,7 @@
           <w:sz w:val="22"/>
           <w:lang w:val="en-US"/>
         </w:rPr>
-        <w:t>The model applies a logarithm to realized variance to compress its scale. The standard specification is:</w:t>
+        <w:t>Taking the logarithm compresses the range of realized variance. The standard HAR-RV specification is:</w:t>
       </w:r>
     </w:p>
     <w:p>
@@ -2364,7 +2364,7 @@
           <w:sz w:val="22"/>
           <w:lang w:val="en-US"/>
         </w:rPr>
-        <w:t>Here beta 0 is the intercept; beta d, beta w, and beta m are the daily, weekly, and monthly coefficients; and epsilon at t plus 1 is the forecast error. Weekly and monthly components average realized variance over the latest 5 and 22 trading days through date t and then apply the logarithm. Every explanatory variable uses information available no later than t.</w:t>
+        <w:t>The intercept is β0, and βd, βw, and βm are the daily, weekly, and monthly coefficients. The error term is ε(t+1). Weekly and monthly components are calculated by averaging realized variance over the latest 5 and 22 trading days through t, then taking the logarithm. All explanatory variables use information available by t.</w:t>
       </w:r>
     </w:p>
     <w:p>
@@ -2400,7 +2400,7 @@
           <w:sz w:val="21"/>
           <w:lang w:val="en-US"/>
         </w:rPr>
-        <w:t>The sample is divided chronologically into training, validation, and test periods, as shown in Table 3. A random split can train on later observations and evaluate on earlier ones, which is inconsistent with forecasting. The development process uses persistence, where today's log realized variance forecasts the next trading day, as the baseline. Five expanding-window splits are generated with TimeSeriesSplit, leaving a one-observation gap between each training and validation period. MSE and MAE are calculated on the log realized variance scale. The final model is evaluated once on the test set after model selection is complete.</w:t>
+        <w:t>The sample is split chronologically into training, validation, and test periods (Table 3). Random splitting could train the model on later observations and assess it on earlier ones, reversing the forecasting sequence. The persistence baseline uses today's log realized variance to predict the next trading day. During development, TimeSeriesSplit generates five expanding-window folds with a one-observation gap between training and validation. Mean squared error (MSE) and mean absolute error (MAE) are measured on the log realized variance scale. Model selection is completed before the final test evaluation.</w:t>
       </w:r>
     </w:p>
     <w:p>
@@ -2679,7 +2679,9 @@
                 <w:sz w:val="19"/>
                 <w:lang w:val="en-US"/>
               </w:rPr>
-              <w:t>2000-02-03 to 2011-02-22</w:t>
+              <w:t>2000-02-03</w:t>
+              <w:br/>
+              <w:t>to 2011-02-22</w:t>
             </w:r>
           </w:p>
         </w:tc>
@@ -2808,7 +2810,9 @@
                 <w:sz w:val="19"/>
                 <w:lang w:val="en-US"/>
               </w:rPr>
-              <w:t>2011-02-24 to 2014-10-22</w:t>
+              <w:t>2011-02-24</w:t>
+              <w:br/>
+              <w:t>to 2014-10-22</w:t>
             </w:r>
           </w:p>
         </w:tc>
@@ -2937,7 +2941,9 @@
                 <w:sz w:val="19"/>
                 <w:lang w:val="en-US"/>
               </w:rPr>
-              <w:t>2014-10-27 to 2018-06-26</w:t>
+              <w:t>2014-10-27</w:t>
+              <w:br/>
+              <w:t>to 2018-06-26</w:t>
             </w:r>
           </w:p>
         </w:tc>
@@ -2968,7 +2974,7 @@
                 <w:sz w:val="19"/>
                 <w:lang w:val="en-US"/>
               </w:rPr>
-              <w:t>Final frozen-model evaluation</w:t>
+              <w:t>Final test evaluation</w:t>
             </w:r>
           </w:p>
         </w:tc>
@@ -3007,7 +3013,7 @@
           <w:sz w:val="22"/>
           <w:lang w:val="en-US"/>
         </w:rPr>
-        <w:t>The standard model's validation residuals have lag-2 autocorrelation and partial autocorrelation of approximately 0.088, while lags 3 and 4 are near zero. Lag 2 is therefore treated as a candidate feature and evaluated for out-of-sample error reduction. Residual diagnostics motivate the feature; they do not by themselves prove that it is useful.</w:t>
+        <w:t>The standard model's validation residuals have lag-2 autocorrelation (ACF) and partial autocorrelation (PACF) of about 0.088; values at lags 3 and 4 are close to zero. This suggests testing Lag 2 as an additional predictor. Residual diagnostics identify a candidate feature, but its value must be checked against out-of-sample errors.</w:t>
       </w:r>
     </w:p>
     <w:p>
@@ -3026,7 +3032,7 @@
           <w:sz w:val="22"/>
           <w:lang w:val="en-US"/>
         </w:rPr>
-        <w:t>When forecasting date t plus 1, Day is log realized variance on t and Lag 2 is log realized variance on t minus 1. They are one and two trading days behind the target, respectively. The extended specification is:</w:t>
+        <w:t>For a forecast at t+1, Day is log realized variance at t and Lag 2 is log realized variance at t−1. The predictors therefore lag the target by one and two trading days, respectively. Adding Lag 2 gives:</w:t>
       </w:r>
     </w:p>
     <w:p>
@@ -3242,7 +3248,7 @@
           <w:sz w:val="19"/>
           <w:lang w:val="en-US"/>
         </w:rPr>
-        <w:t>Table 4 Diagnostic and Forecast Evidence Before and After Lag 2</w:t>
+        <w:t>Table 4 Diagnostics and Forecast Errors With and Without Lag 2</w:t>
       </w:r>
     </w:p>
     <w:tbl>
@@ -3340,7 +3346,9 @@
                 <w:sz w:val="18"/>
                 <w:lang w:val="en-US"/>
               </w:rPr>
-              <w:t>Standard HAR-RV</w:t>
+              <w:t>Standard</w:t>
+              <w:br/>
+              <w:t>HAR-RV</w:t>
             </w:r>
           </w:p>
         </w:tc>
@@ -3823,7 +3831,7 @@
                 <w:sz w:val="19"/>
                 <w:lang w:val="en-US"/>
               </w:rPr>
-              <w:t>No longer significant at 5%</w:t>
+              <w:t>Null not rejected at 5%</w:t>
             </w:r>
           </w:p>
         </w:tc>
@@ -3960,7 +3968,7 @@
                 <w:sz w:val="19"/>
                 <w:lang w:val="en-US"/>
               </w:rPr>
-              <w:t>No longer significant at 5%</w:t>
+              <w:t>Null not rejected at 5%</w:t>
             </w:r>
           </w:p>
         </w:tc>
@@ -4392,7 +4400,7 @@
           <w:sz w:val="22"/>
           <w:lang w:val="en-US"/>
         </w:rPr>
-        <w:t>After Lag 2 is added, the validation residual ACF and PACF at lag 2 fall to approximately 0.004. Ljung-Box p-values at lags 5 and 10 rise from 0.0023 and 0.0087 to 0.2463 and 0.3207. At the 5% level, these two tests no longer reject the null of no residual autocorrelation, indicating weaker linear dependence over the tested lag ranges. Forecast improvement must still be established with out-of-sample errors.</w:t>
+        <w:t>With Lag 2, the validation residual ACF and PACF at lag 2 fall to about 0.004. Ljung-Box p-values at lags 5 and 10 rise from 0.0023 and 0.0087 to 0.2463 and 0.3207. Neither test rejects the null of no residual autocorrelation at the 5% level. This suggests weaker linear dependence over the tested lag ranges, but does not establish independence or improved forecast accuracy.</w:t>
       </w:r>
     </w:p>
     <w:p>
@@ -4557,7 +4565,7 @@
           <w:sz w:val="21"/>
           <w:lang w:val="en-US"/>
         </w:rPr>
-        <w:t>In time-series cross-validation, mean MSE falls from 0.350979 for standard HAR-RV to 0.345829 after Lag 2 is added, a reduction of approximately 1.47%. MSE declines in all five validation folds. A validation-set ablation that holds Day, Week, and Month fixed lowers MSE from 0.477745 to 0.466884, an improvement of approximately 2.27%. Both comparisons support a small incremental contribution from Lag 2.</w:t>
+        <w:t>Across the five time-series validation folds, mean MSE falls from 0.350979 for standard HAR-RV to 0.345829 with Lag 2, a reduction of about 1.47%. MSE falls in every fold. In the separate validation-set ablation, adding Lag 2 while retaining Day, Week, and Month as predictors lowers MSE from 0.477745 to 0.466884, or about 2.27%. Both comparisons support a small gain from Lag 2. Table 5 reports test errors and percentage reductions relative to persistence.</w:t>
       </w:r>
     </w:p>
     <w:p>
@@ -4739,7 +4747,7 @@
                 <w:sz w:val="18"/>
                 <w:lang w:val="en-US"/>
               </w:rPr>
-              <w:t>MSE Gain vs. Baseline</w:t>
+              <w:t>MSE Reduction</w:t>
             </w:r>
           </w:p>
         </w:tc>
@@ -4773,7 +4781,7 @@
                 <w:sz w:val="18"/>
                 <w:lang w:val="en-US"/>
               </w:rPr>
-              <w:t>MAE Gain vs. Baseline</w:t>
+              <w:t>MAE Reduction</w:t>
             </w:r>
           </w:p>
         </w:tc>
@@ -5261,6 +5269,7 @@
     </w:tbl>
     <w:p>
       <w:pPr>
+        <w:keepLines/>
         <w:widowControl/>
         <w:spacing w:line="276" w:lineRule="auto" w:before="80" w:after="100"/>
         <w:ind w:firstLine="420"/>
@@ -5274,7 +5283,7 @@
           <w:sz w:val="21"/>
           <w:lang w:val="en-US"/>
         </w:rPr>
-        <w:t>The selected model uses Day + Lag 2 + Week + Month. On the independent test set, its MSE and MAE are 1.49% and 0.61% lower than those of standard HAR-RV. The direction agrees with cross-validation and validation ablation results. The evidence supports retaining Lag 2 in this sample, but it does not by itself establish statistical significance.</w:t>
+        <w:t>The final model uses Day + Lag 2 + Week + Month. On the independent test set, its MSE and MAE are 1.49% and 0.61% lower than standard HAR-RV. These reductions agree in direction with cross-validation and the validation-set ablation. They support retaining Lag 2 in this sample, but do not establish that the improvement is statistically significant.</w:t>
       </w:r>
     </w:p>
     <w:p>
@@ -5293,7 +5302,7 @@
           <w:u w:val="none"/>
           <w:lang w:val="en-US"/>
         </w:rPr>
-        <w:t>6 Model Artifacts and Prediction Output</w:t>
+        <w:t>6 Saved Model and Forecast Output</w:t>
       </w:r>
     </w:p>
     <w:p>
@@ -5308,7 +5317,7 @@
           <w:sz w:val="21"/>
           <w:lang w:val="en-US"/>
         </w:rPr>
-        <w:t>After model selection, the final specification is refitted on 3,693 combined training and validation observations. The saved model is accompanied by metadata recording feature order, coefficients, training dates, software version, and test metrics. Prediction loads this same model version without retraining, which supports reproducibility. Table 6 reports the saved files and an example forecast at the end of the historical sample. Dates use UTC.</w:t>
+        <w:t>After model selection, the final model is refitted on 3,693 combined training and validation observations. The model file is saved with metadata containing feature order, coefficients, training dates, software version, and test metrics. Forecasts load this saved version without retraining, so results can be checked against the same fitted model. Table 6 lists the files and a forecast made at the end of the historical sample. Dates are recorded in UTC.</w:t>
       </w:r>
     </w:p>
     <w:p>
@@ -5326,7 +5335,7 @@
           <w:sz w:val="19"/>
           <w:lang w:val="en-US"/>
         </w:rPr>
-        <w:t>Table 6 Final Model Artifacts and Example Historical Forecast</w:t>
+        <w:t>Table 6 Saved Files and Example Historical Forecast</w:t>
       </w:r>
     </w:p>
     <w:tbl>
@@ -6177,7 +6186,7 @@
           <w:sz w:val="21"/>
           <w:lang w:val="en-US"/>
         </w:rPr>
-        <w:t>Standard HAR-RV adds weekly and monthly information to the daily component, and Lag 2 further reduces error in every validation fold and on the independent test set. The result supports retaining Lag 2 for this specification, but the increment is limited and should be re-evaluated in other market regimes.</w:t>
+        <w:t>HAR-RV combines daily, weekly, and monthly variance information. Adding Lag 2 lowers error in every validation fold and on the independent test set. The gain is small, and its performance in other market periods remains to be tested.</w:t>
       </w:r>
     </w:p>
     <w:p>
@@ -6192,7 +6201,7 @@
           <w:sz w:val="21"/>
           <w:lang w:val="en-US"/>
         </w:rPr>
-        <w:t>Ljung-Box tests remain significant at several lags in the final test period, showing that the model omits some linear time dependence. Residuals are defined as actual minus predicted; their mean is approximately -0.082, so the model overpredicts log realized variance on average in the test period. Results for squared residuals also vary by lag, so the model cannot be considered a complete description of conditional variation. Future work could compare leverage-aware HAR variants, rolling estimation, regularized regressions, or tree models while retaining chronological validation and untouched evaluation data.</w:t>
+        <w:t>In the test period, Ljung-Box tests remain significant at several lags, indicating residual linear dependence. Residuals are actual minus predicted values; their mean of about -0.082 means the model overpredicts log realized variance on average. Tests of squared residuals also differ across lags, so dependence in conditional variance may remain. Further comparisons could include HAR variants with leverage effects, rolling estimation, regularized regression, or tree models. These comparisons should preserve chronological validation and use evaluation data that have not informed model selection.</w:t>
       </w:r>
     </w:p>
     <w:p>
@@ -6211,7 +6220,7 @@
           <w:u w:val="none"/>
           <w:lang w:val="en-US"/>
         </w:rPr>
-        <w:t>Appendix Reproduction</w:t>
+        <w:t>Appendix Reproducing the Analysis</w:t>
       </w:r>
     </w:p>
     <w:p>
@@ -6226,7 +6235,7 @@
           <w:sz w:val="20"/>
           <w:lang w:val="en-US"/>
         </w:rPr>
-        <w:t>From the project root, run python run_pipeline.py --stage all to reproduce the workflow and python -m unittest discover -s tests -v to run the seven automated checks. The saved prediction is historical, not a live market forecast.</w:t>
+        <w:t>From the project root, run python run_pipeline.py --stage all to execute the workflow. Run python -m unittest discover -s tests -v for the seven automated checks. The example prediction refers to the end of the historical sample and is not a live market forecast.</w:t>
       </w:r>
     </w:p>
     <w:sectPr>

</xml_diff>